<commit_message>
DocuSign (JWT Grant): send proposals for signature, HMAC Connect webhook, signed PDF attached once, job to Signed
Co-Authored-By: Claude Opus 5.5 <noreply@anthropic.com>
Claude-Session: https://claude.ai/code/session_01HuCy5sNK75X3oCBk73moQ1
</commit_message>
<xml_diff>
--- a/templates/placeholder/ESS_Proposal.docx
+++ b/templates/placeholder/ESS_Proposal.docx
@@ -298,7 +298,29 @@
     </w:p>
     <w:p>
       <w:r>
-        <w:t xml:space="preserve">Signature: ________________________________   Date: ______________</w:t>
+        <w:t xml:space="preserve">Signature: </w:t>
+      </w:r>
+      <w:r>
+        <w:rPr>
+          <w:color w:val="FFFFFF"/>
+          <w:sz w:val="2"/>
+          <w:szCs w:val="2"/>
+        </w:rPr>
+        <w:t xml:space="preserve">\ess_sign\</w:t>
+      </w:r>
+      <w:r>
+        <w:t xml:space="preserve">________________________________   Date: </w:t>
+      </w:r>
+      <w:r>
+        <w:rPr>
+          <w:color w:val="FFFFFF"/>
+          <w:sz w:val="2"/>
+          <w:szCs w:val="2"/>
+        </w:rPr>
+        <w:t xml:space="preserve">\ess_date\</w:t>
+      </w:r>
+      <w:r>
+        <w:t xml:space="preserve">______________</w:t>
       </w:r>
     </w:p>
     <w:sectPr>

</xml_diff>